<commit_message>
Update contact email and hide LinkedIn
</commit_message>
<xml_diff>
--- a/Kianan_Ibrahimov_Unity_Developer.docx
+++ b/Kianan_Ibrahimov_Unity_Developer.docx
@@ -121,7 +121,7 @@
                   <w:color w:val="FFFFFF"/>
                   <w:sz w:val="16"/>
                 </w:rPr>
-                <w:t>kenanibragimov@ro.ru</w:t>
+                <w:t>dumau.art@mail.ru</w:t>
               </w:r>
             </w:hyperlink>
           </w:p>
@@ -141,25 +141,6 @@
                   <w:sz w:val="16"/>
                 </w:rPr>
                 <w:t>t.me/kenanIbragimov</w:t>
-              </w:r>
-            </w:hyperlink>
-          </w:p>
-          <w:p>
-            <w:pPr>
-              <w:keepNext w:val="0"/>
-              <w:keepLines w:val="0"/>
-              <w:widowControl/>
-              <w:spacing w:before="0" w:after="44" w:line="240" w:lineRule="auto"/>
-              <w:jc w:val="right"/>
-            </w:pPr>
-            <w:hyperlink r:id="rId13">
-              <w:r>
-                <w:rPr>
-                  <w:rFonts w:ascii="Arial" w:hAnsi="Arial"/>
-                  <w:color w:val="FFFFFF"/>
-                  <w:sz w:val="16"/>
-                </w:rPr>
-                <w:t>LinkedIn</w:t>
               </w:r>
             </w:hyperlink>
           </w:p>

</xml_diff>